<commit_message>
Finished 'corrappln' and 'missingpartsnw'.
</commit_message>
<xml_diff>
--- a/project/documents/communications/MissingPartsXmit.docx
+++ b/project/documents/communications/MissingPartsXmit.docx
@@ -105,53 +105,30 @@
           <w:sz w:val="24"/>
         </w:rPr>
       </w:pPr>
-      <w:proofErr w:type="spellStart"/>
-      <w:r>
-        <w:rPr>
-          <w:sz w:val="24"/>
-          <w:lang w:val="fr-FR"/>
-        </w:rPr>
-        <w:t>Applicant</w:t>
-      </w:r>
-      <w:proofErr w:type="spellEnd"/>
-      <w:r>
-        <w:rPr>
-          <w:sz w:val="24"/>
-          <w:lang w:val="fr-FR"/>
-        </w:rPr>
-        <w:t>:</w:t>
-      </w:r>
-      <w:r>
-        <w:rPr>
-          <w:sz w:val="24"/>
-          <w:lang w:val="fr-FR"/>
-        </w:rPr>
-        <w:tab/>
-      </w:r>
-      <w:r>
-        <w:rPr>
-          <w:sz w:val="24"/>
-        </w:rPr>
-        <w:t>&lt;&lt;</w:t>
-      </w:r>
-      <w:proofErr w:type="spellStart"/>
-      <w:r>
-        <w:rPr>
-          <w:sz w:val="24"/>
-        </w:rPr>
-        <w:t>inventorEt</w:t>
-      </w:r>
-      <w:r>
-        <w:rPr>
-          <w:sz w:val="24"/>
-        </w:rPr>
-        <w:t>a</w:t>
-      </w:r>
-      <w:r>
-        <w:rPr>
-          <w:sz w:val="24"/>
-        </w:rPr>
-        <w:t>l</w:t>
+      <w:r>
+        <w:rPr>
+          <w:sz w:val="24"/>
+        </w:rPr>
+        <w:t xml:space="preserve">Inventor(s):  </w:t>
+      </w:r>
+      <w:r>
+        <w:rPr>
+          <w:sz w:val="24"/>
+        </w:rPr>
+        <w:t xml:space="preserve">   </w:t>
+      </w:r>
+      <w:r>
+        <w:rPr>
+          <w:sz w:val="24"/>
+        </w:rPr>
+        <w:t>&lt;&lt;</w:t>
+      </w:r>
+      <w:proofErr w:type="spellStart"/>
+      <w:r>
+        <w:rPr>
+          <w:sz w:val="24"/>
+        </w:rPr>
+        <w:t>inventorEtal</w:t>
       </w:r>
       <w:proofErr w:type="spellEnd"/>
       <w:r>
@@ -558,171 +535,249 @@
         <w:spacing w:line="360" w:lineRule="auto"/>
         <w:ind w:firstLine="720"/>
         <w:rPr>
+          <w:sz w:val="24"/>
+        </w:rPr>
+      </w:pPr>
+      <w:r>
+        <w:rPr>
+          <w:sz w:val="24"/>
+        </w:rPr>
+        <w:t>In response to t</w:t>
+      </w:r>
+      <w:r>
+        <w:rPr>
+          <w:sz w:val="24"/>
+        </w:rPr>
+        <w:t>he Notice to File Missing Parts&lt;&lt;</w:t>
+      </w:r>
+      <w:proofErr w:type="spellStart"/>
+      <w:r>
+        <w:rPr>
+          <w:sz w:val="24"/>
+        </w:rPr>
+        <w:t>enclosedText</w:t>
+      </w:r>
+      <w:proofErr w:type="spellEnd"/>
+      <w:r>
+        <w:rPr>
+          <w:sz w:val="24"/>
+        </w:rPr>
+        <w:t>&gt;&gt;</w:t>
+      </w:r>
+      <w:r>
+        <w:rPr>
+          <w:sz w:val="24"/>
+        </w:rPr>
+        <w:t xml:space="preserve">, we submit </w:t>
+      </w:r>
+      <w:r>
+        <w:rPr>
+          <w:sz w:val="24"/>
+        </w:rPr>
+        <w:t>&lt;&lt;</w:t>
+      </w:r>
+      <w:proofErr w:type="spellStart"/>
+      <w:r>
+        <w:rPr>
+          <w:sz w:val="24"/>
+        </w:rPr>
+        <w:t>submitText</w:t>
+      </w:r>
+      <w:proofErr w:type="spellEnd"/>
+      <w:r>
+        <w:rPr>
+          <w:sz w:val="24"/>
+        </w:rPr>
+        <w:t>&gt;&gt;</w:t>
+      </w:r>
+      <w:r>
+        <w:rPr>
           <w:noProof/>
           <w:sz w:val="24"/>
-        </w:rPr>
-      </w:pPr>
-      <w:r>
-        <w:rPr>
-          <w:sz w:val="24"/>
-        </w:rPr>
-        <w:t>In response to t</w:t>
-      </w:r>
-      <w:r>
-        <w:rPr>
-          <w:sz w:val="24"/>
-        </w:rPr>
-        <w:t>he Notice to File Missing Parts&lt;&lt;</w:t>
-      </w:r>
-      <w:proofErr w:type="spellStart"/>
-      <w:r>
-        <w:rPr>
-          <w:sz w:val="24"/>
-        </w:rPr>
-        <w:t>enclosedText</w:t>
-      </w:r>
-      <w:proofErr w:type="spellEnd"/>
-      <w:r>
-        <w:rPr>
-          <w:sz w:val="24"/>
-        </w:rPr>
-        <w:t>&gt;&gt;</w:t>
-      </w:r>
-      <w:r>
-        <w:rPr>
-          <w:sz w:val="24"/>
-        </w:rPr>
-        <w:t xml:space="preserve">, we submit </w:t>
-      </w:r>
-      <w:r>
-        <w:rPr>
-          <w:sz w:val="24"/>
-        </w:rPr>
-        <w:t>&lt;&lt;</w:t>
-      </w:r>
-      <w:proofErr w:type="spellStart"/>
-      <w:r>
-        <w:rPr>
-          <w:sz w:val="24"/>
-        </w:rPr>
-        <w:t>submitText</w:t>
-      </w:r>
-      <w:proofErr w:type="spellEnd"/>
-      <w:r>
-        <w:rPr>
-          <w:sz w:val="24"/>
-        </w:rPr>
-        <w:t>&gt;&gt;</w:t>
-      </w:r>
+          <w:szCs w:val="22"/>
+        </w:rPr>
+        <w:t>&lt;&lt;</w:t>
+      </w:r>
+      <w:proofErr w:type="spellStart"/>
       <w:r>
         <w:rPr>
           <w:noProof/>
           <w:sz w:val="24"/>
           <w:szCs w:val="22"/>
         </w:rPr>
-        <w:t>&lt;&lt;</w:t>
-      </w:r>
-      <w:proofErr w:type="spellStart"/>
+        <w:t>checkDepositText</w:t>
+      </w:r>
+      <w:proofErr w:type="spellEnd"/>
       <w:r>
         <w:rPr>
           <w:noProof/>
           <w:sz w:val="24"/>
           <w:szCs w:val="22"/>
         </w:rPr>
-        <w:t>checkDepositText</w:t>
-      </w:r>
-      <w:proofErr w:type="spellEnd"/>
+        <w:t>&gt;&gt;</w:t>
+      </w:r>
       <w:r>
         <w:rPr>
           <w:noProof/>
           <w:sz w:val="24"/>
-          <w:szCs w:val="22"/>
-        </w:rPr>
-        <w:t>&gt;&gt;</w:t>
+        </w:rPr>
+        <w:t xml:space="preserve"> </w:t>
+      </w:r>
+      <w:r>
+        <w:rPr>
+          <w:sz w:val="24"/>
+        </w:rPr>
+        <w:t xml:space="preserve">in the amount of </w:t>
+      </w:r>
+      <w:r>
+        <w:rPr>
+          <w:sz w:val="24"/>
+        </w:rPr>
+        <w:t>&lt;&lt;</w:t>
+      </w:r>
+      <w:proofErr w:type="spellStart"/>
+      <w:r>
+        <w:rPr>
+          <w:sz w:val="24"/>
+        </w:rPr>
+        <w:t>amountText</w:t>
+      </w:r>
+      <w:proofErr w:type="spellEnd"/>
+      <w:r>
+        <w:rPr>
+          <w:sz w:val="24"/>
+        </w:rPr>
+        <w:t>&gt;&gt;</w:t>
+      </w:r>
+      <w:r>
+        <w:rPr>
+          <w:sz w:val="24"/>
+        </w:rPr>
+        <w:t xml:space="preserve"> to cover the </w:t>
       </w:r>
       <w:r>
         <w:rPr>
           <w:noProof/>
           <w:sz w:val="24"/>
         </w:rPr>
-        <w:t xml:space="preserve"> </w:t>
-      </w:r>
-      <w:r>
-        <w:rPr>
-          <w:sz w:val="24"/>
-        </w:rPr>
-        <w:t xml:space="preserve">in the amount of </w:t>
-      </w:r>
-      <w:r>
-        <w:rPr>
-          <w:sz w:val="24"/>
-        </w:rPr>
-        <w:t>&lt;&lt;</w:t>
-      </w:r>
-      <w:proofErr w:type="spellStart"/>
-      <w:r>
-        <w:rPr>
-          <w:sz w:val="24"/>
-        </w:rPr>
-        <w:t>amountText</w:t>
-      </w:r>
-      <w:proofErr w:type="spellEnd"/>
-      <w:r>
-        <w:rPr>
-          <w:sz w:val="24"/>
-        </w:rPr>
-        <w:t>&gt;&gt;</w:t>
-      </w:r>
-      <w:r>
-        <w:rPr>
-          <w:sz w:val="24"/>
-        </w:rPr>
-        <w:t xml:space="preserve"> to cover the </w:t>
-      </w:r>
-      <w:r>
+        <w:t>&lt;&lt;entitySize&gt;&gt;</w:t>
+      </w:r>
+      <w:r>
+        <w:rPr>
+          <w:sz w:val="24"/>
+        </w:rPr>
+        <w:t xml:space="preserve"> Entity</w:t>
+      </w:r>
+      <w:r>
+        <w:rPr>
+          <w:sz w:val="24"/>
+        </w:rPr>
+        <w:t xml:space="preserve"> surcharge</w:t>
+      </w:r>
+      <w:r>
+        <w:rPr>
+          <w:sz w:val="24"/>
+        </w:rPr>
+        <w:t>&lt;&lt;</w:t>
+      </w:r>
+      <w:proofErr w:type="spellStart"/>
+      <w:r>
+        <w:rPr>
+          <w:sz w:val="24"/>
+        </w:rPr>
+        <w:t>feeIncludedText</w:t>
+      </w:r>
+      <w:proofErr w:type="spellEnd"/>
+      <w:r>
+        <w:rPr>
+          <w:sz w:val="24"/>
+        </w:rPr>
+        <w:t>&gt;&gt;</w:t>
+      </w:r>
+      <w:r>
+        <w:rPr>
+          <w:sz w:val="24"/>
+        </w:rPr>
+        <w:t>.</w:t>
+      </w:r>
+    </w:p>
+    <w:p>
+      <w:pPr>
+        <w:spacing w:line="360" w:lineRule="auto"/>
+        <w:ind w:firstLine="720"/>
         <w:rPr>
           <w:noProof/>
           <w:sz w:val="24"/>
         </w:rPr>
-        <w:t>&lt;&lt;entitySize&gt;&gt;</w:t>
-      </w:r>
-      <w:r>
-        <w:rPr>
-          <w:sz w:val="24"/>
-        </w:rPr>
-        <w:t xml:space="preserve"> Entity</w:t>
-      </w:r>
-      <w:r>
-        <w:rPr>
-          <w:sz w:val="24"/>
-        </w:rPr>
-        <w:t xml:space="preserve"> surcharge</w:t>
-      </w:r>
-      <w:r>
-        <w:rPr>
-          <w:sz w:val="24"/>
-        </w:rPr>
-        <w:t>&lt;&lt;</w:t>
-      </w:r>
-      <w:proofErr w:type="spellStart"/>
-      <w:r>
-        <w:rPr>
-          <w:sz w:val="24"/>
-        </w:rPr>
-        <w:t>feeIncludedText</w:t>
-      </w:r>
-      <w:proofErr w:type="spellEnd"/>
-      <w:r>
-        <w:rPr>
-          <w:sz w:val="24"/>
-        </w:rPr>
-        <w:t>&gt;&gt;</w:t>
-      </w:r>
-      <w:r>
-        <w:rPr>
-          <w:sz w:val="24"/>
-        </w:rPr>
-        <w:t>.</w:t>
+      </w:pPr>
+      <w:r>
+        <w:rPr>
+          <w:sz w:val="24"/>
+        </w:rPr>
+        <w:t>&lt;&lt;</w:t>
+      </w:r>
+      <w:proofErr w:type="spellStart"/>
+      <w:r>
+        <w:rPr>
+          <w:sz w:val="24"/>
+        </w:rPr>
+        <w:t>markupCopy</w:t>
+      </w:r>
+      <w:r>
+        <w:rPr>
+          <w:sz w:val="24"/>
+        </w:rPr>
+        <w:t>A</w:t>
+      </w:r>
+      <w:proofErr w:type="spellEnd"/>
+      <w:r>
+        <w:rPr>
+          <w:sz w:val="24"/>
+        </w:rPr>
+        <w:t>&gt;&gt;</w:t>
+      </w:r>
+      <w:r>
+        <w:rPr>
+          <w:color w:val="FF0000"/>
+          <w:sz w:val="24"/>
+        </w:rPr>
+        <w:t>&lt;&lt;</w:t>
+      </w:r>
+      <w:proofErr w:type="spellStart"/>
+      <w:r>
+        <w:rPr>
+          <w:color w:val="FF0000"/>
+          <w:sz w:val="24"/>
+        </w:rPr>
+        <w:t>markupComments</w:t>
+      </w:r>
+      <w:proofErr w:type="spellEnd"/>
+      <w:r>
+        <w:rPr>
+          <w:color w:val="FF0000"/>
+          <w:sz w:val="24"/>
+        </w:rPr>
+        <w:t>&gt;&gt;</w:t>
+      </w:r>
+      <w:r>
+        <w:rPr>
+          <w:sz w:val="24"/>
+        </w:rPr>
+        <w:t>&lt;&lt;</w:t>
+      </w:r>
+      <w:proofErr w:type="spellStart"/>
+      <w:r>
+        <w:rPr>
+          <w:sz w:val="24"/>
+        </w:rPr>
+        <w:t>markupCopyB</w:t>
+      </w:r>
+      <w:proofErr w:type="spellEnd"/>
+      <w:r>
+        <w:rPr>
+          <w:sz w:val="24"/>
+        </w:rPr>
+        <w:t>&gt;&gt;</w:t>
       </w:r>
     </w:p>
     <w:p>
@@ -958,10 +1013,83 @@
     </w:p>
     <w:p>
       <w:pPr>
-        <w:rPr>
-          <w:sz w:val="24"/>
-        </w:rPr>
-      </w:pPr>
+        <w:spacing w:after="120"/>
+        <w:ind w:firstLine="3600"/>
+        <w:rPr>
+          <w:sz w:val="24"/>
+        </w:rPr>
+      </w:pPr>
+    </w:p>
+    <w:p>
+      <w:pPr>
+        <w:rPr>
+          <w:sz w:val="24"/>
+        </w:rPr>
+      </w:pPr>
+      <w:r>
+        <w:rPr>
+          <w:sz w:val="24"/>
+        </w:rPr>
+        <w:tab/>
+      </w:r>
+      <w:r>
+        <w:rPr>
+          <w:sz w:val="24"/>
+        </w:rPr>
+        <w:t>&lt;&lt;</w:t>
+      </w:r>
+      <w:proofErr w:type="spellStart"/>
+      <w:r>
+        <w:rPr>
+          <w:sz w:val="24"/>
+        </w:rPr>
+        <w:t>signatureDate</w:t>
+      </w:r>
+      <w:proofErr w:type="spellEnd"/>
+      <w:r>
+        <w:rPr>
+          <w:sz w:val="24"/>
+        </w:rPr>
+        <w:t>&gt;&gt;</w:t>
+      </w:r>
+      <w:r>
+        <w:rPr>
+          <w:sz w:val="24"/>
+        </w:rPr>
+        <w:tab/>
+      </w:r>
+      <w:r>
+        <w:rPr>
+          <w:sz w:val="24"/>
+        </w:rPr>
+        <w:tab/>
+      </w:r>
+      <w:r>
+        <w:rPr>
+          <w:sz w:val="24"/>
+        </w:rPr>
+        <w:tab/>
+      </w:r>
+      <w:r>
+        <w:rPr>
+          <w:sz w:val="24"/>
+        </w:rPr>
+        <w:t>&lt;&lt;</w:t>
+      </w:r>
+      <w:proofErr w:type="spellStart"/>
+      <w:r>
+        <w:rPr>
+          <w:sz w:val="24"/>
+        </w:rPr>
+        <w:t>echoSignature</w:t>
+      </w:r>
+      <w:proofErr w:type="spellEnd"/>
+      <w:r>
+        <w:rPr>
+          <w:sz w:val="24"/>
+        </w:rPr>
+        <w:t>&gt;&gt;</w:t>
+      </w:r>
     </w:p>
     <w:p>
       <w:pPr>
@@ -1060,188 +1188,6 @@
           <w:szCs w:val="18"/>
         </w:rPr>
       </w:pPr>
-    </w:p>
-    <w:p>
-      <w:pPr>
-        <w:rPr>
-          <w:sz w:val="18"/>
-          <w:szCs w:val="18"/>
-        </w:rPr>
-      </w:pPr>
-      <w:r>
-        <w:rPr>
-          <w:sz w:val="18"/>
-          <w:szCs w:val="18"/>
-          <w:u w:val="single"/>
-        </w:rPr>
-        <w:t>CERTIFICATE UNDER 37 CFR 1.8:</w:t>
-      </w:r>
-      <w:r>
-        <w:rPr>
-          <w:sz w:val="18"/>
-          <w:szCs w:val="18"/>
-        </w:rPr>
-        <w:t xml:space="preserve">  The undersigned hereby certifies that this correspondence is being </w:t>
-      </w:r>
-      <w:r>
-        <w:rPr>
-          <w:noProof/>
-          <w:sz w:val="18"/>
-          <w:szCs w:val="18"/>
-        </w:rPr>
-        <w:t xml:space="preserve">&lt;&lt;certificateText&gt;&gt; </w:t>
-      </w:r>
-      <w:r>
-        <w:rPr>
-          <w:sz w:val="18"/>
-          <w:szCs w:val="18"/>
-        </w:rPr>
-        <w:t xml:space="preserve">addressed to:  </w:t>
-      </w:r>
-      <w:r>
-        <w:rPr>
-          <w:sz w:val="18"/>
-          <w:szCs w:val="18"/>
-        </w:rPr>
-        <w:t>M</w:t>
-      </w:r>
-      <w:r>
-        <w:rPr>
-          <w:sz w:val="18"/>
-          <w:szCs w:val="18"/>
-        </w:rPr>
-        <w:t xml:space="preserve">ail Stop Missing Parts, </w:t>
-      </w:r>
-      <w:r>
-        <w:rPr>
-          <w:sz w:val="18"/>
-          <w:szCs w:val="18"/>
-        </w:rPr>
-        <w:t xml:space="preserve">Commissioner for Patents, P.O. Box 1450, Alexandria, VA 22313-1450 on this </w:t>
-      </w:r>
-      <w:r>
-        <w:rPr>
-          <w:sz w:val="18"/>
-          <w:szCs w:val="18"/>
-          <w:u w:val="single"/>
-        </w:rPr>
-        <w:t xml:space="preserve">          </w:t>
-      </w:r>
-      <w:r>
-        <w:rPr>
-          <w:sz w:val="18"/>
-          <w:szCs w:val="18"/>
-        </w:rPr>
-        <w:t xml:space="preserve"> day of</w:t>
-      </w:r>
-      <w:r>
-        <w:rPr>
-          <w:sz w:val="18"/>
-          <w:szCs w:val="18"/>
-        </w:rPr>
-        <w:t xml:space="preserve"> &lt;&lt;</w:t>
-      </w:r>
-      <w:proofErr w:type="spellStart"/>
-      <w:r>
-        <w:rPr>
-          <w:sz w:val="18"/>
-          <w:szCs w:val="18"/>
-        </w:rPr>
-        <w:t>currentMo</w:t>
-      </w:r>
-      <w:proofErr w:type="spellEnd"/>
-      <w:r>
-        <w:rPr>
-          <w:sz w:val="18"/>
-          <w:szCs w:val="18"/>
-        </w:rPr>
-        <w:t>&gt;&gt;</w:t>
-      </w:r>
-      <w:r>
-        <w:rPr>
-          <w:sz w:val="18"/>
-          <w:szCs w:val="18"/>
-        </w:rPr>
-        <w:t>,</w:t>
-      </w:r>
-      <w:r>
-        <w:rPr>
-          <w:sz w:val="18"/>
-          <w:szCs w:val="18"/>
-        </w:rPr>
-        <w:t xml:space="preserve"> &lt;&lt;</w:t>
-      </w:r>
-      <w:proofErr w:type="spellStart"/>
-      <w:r>
-        <w:rPr>
-          <w:sz w:val="18"/>
-          <w:szCs w:val="18"/>
-        </w:rPr>
-        <w:t>currentYr</w:t>
-      </w:r>
-      <w:proofErr w:type="spellEnd"/>
-      <w:r>
-        <w:rPr>
-          <w:sz w:val="18"/>
-          <w:szCs w:val="18"/>
-        </w:rPr>
-        <w:t>&gt;&gt;</w:t>
-      </w:r>
-      <w:r>
-        <w:rPr>
-          <w:sz w:val="18"/>
-          <w:szCs w:val="18"/>
-        </w:rPr>
-        <w:t>.</w:t>
-      </w:r>
-    </w:p>
-    <w:p>
-      <w:pPr>
-        <w:rPr>
-          <w:sz w:val="18"/>
-          <w:szCs w:val="18"/>
-        </w:rPr>
-      </w:pPr>
-    </w:p>
-    <w:p>
-      <w:pPr>
-        <w:tabs>
-          <w:tab w:val="left" w:pos="5040"/>
-        </w:tabs>
-        <w:rPr>
-          <w:sz w:val="18"/>
-          <w:szCs w:val="18"/>
-        </w:rPr>
-      </w:pPr>
-      <w:r>
-        <w:rPr>
-          <w:sz w:val="18"/>
-          <w:szCs w:val="18"/>
-        </w:rPr>
-        <w:t>________________________</w:t>
-      </w:r>
-      <w:r>
-        <w:rPr>
-          <w:sz w:val="18"/>
-          <w:szCs w:val="18"/>
-        </w:rPr>
-        <w:t>___________________________</w:t>
-      </w:r>
-      <w:r>
-        <w:rPr>
-          <w:sz w:val="18"/>
-          <w:szCs w:val="18"/>
-        </w:rPr>
-        <w:tab/>
-        <w:t>__________________</w:t>
-      </w:r>
-      <w:r>
-        <w:rPr>
-          <w:sz w:val="18"/>
-          <w:szCs w:val="18"/>
-        </w:rPr>
-        <w:t>___________________________</w:t>
-      </w:r>
     </w:p>
     <w:p>
       <w:pPr>
@@ -1250,13 +1196,6 @@
           <w:tab w:val="left" w:pos="5040"/>
         </w:tabs>
       </w:pPr>
-      <w:r>
-        <w:t>Name</w:t>
-      </w:r>
-      <w:r>
-        <w:tab/>
-        <w:t>Signature</w:t>
-      </w:r>
     </w:p>
     <w:sectPr>
       <w:endnotePr>

</xml_diff>

<commit_message>
Updated multiple merge functions.
</commit_message>
<xml_diff>
--- a/project/documents/communications/MissingPartsXmit.docx
+++ b/project/documents/communications/MissingPartsXmit.docx
@@ -700,16 +700,12 @@
         </w:rPr>
         <w:t>.</w:t>
       </w:r>
-    </w:p>
-    <w:p>
-      <w:pPr>
-        <w:spacing w:line="360" w:lineRule="auto"/>
-        <w:ind w:firstLine="720"/>
-        <w:rPr>
-          <w:noProof/>
-          <w:sz w:val="24"/>
-        </w:rPr>
-      </w:pPr>
+      <w:r>
+        <w:rPr>
+          <w:sz w:val="24"/>
+        </w:rPr>
+        <w:t xml:space="preserve"> </w:t>
+      </w:r>
       <w:r>
         <w:rPr>
           <w:sz w:val="24"/>

</xml_diff>